<commit_message>
fix: equation label, table parsing, OMML rendering, ref colon support
- Fix label misattribution: skip whitespace tokens before label check
  in equation/figure/table extraction (extractor_v2.py)
- Fix table not parsed after equation+label (consequence of label bug)
- Add MathML→OMML converter (mml2omml.py) for proper equation rendering
- Update scanner REF/REF_INLINE patterns to support colon separator
  (@tbl:test, @eq:formula)
- Update golden DOCX fixtures for new parser output
</commit_message>
<xml_diff>
--- a/fixtures/equations/math-formulas.docx
+++ b/fixtures/equations/math-formulas.docx
@@ -18,16 +18,22 @@
     </w:p>
     <w:p>
       <w:pPr/>
-      <w:r/>
-    </w:p>
-    <w:p>
-      <w:pPr/>
       <w:r>
-        <w:t xml:space="preserve">[FORMULA: </w:t>
-        <w:br/>
-        <w:t>E = m c^2</w:t>
-        <w:br/>
-        <w:t>]</w:t>
+        <m:oMath>
+          <m:r>
+            <m:t>E</m:t>
+          </m:r>
+          <m:r>
+            <m:t>=</m:t>
+          </m:r>
+          <m:r>
+            <m:t>m</m:t>
+          </m:r>
+          <m:sSup>
+            <m:e/>
+            <m:sup/>
+          </m:sSup>
+        </m:oMath>
       </w:r>
     </w:p>
     <w:p>
@@ -38,16 +44,82 @@
     </w:p>
     <w:p>
       <w:pPr/>
-      <w:r/>
-    </w:p>
-    <w:p>
-      <w:pPr/>
       <w:r>
-        <w:t xml:space="preserve">[FORMULA: </w:t>
-        <w:br/>
-        <w:t>x = (-b +- sqrt(b^2 - 4 a c)) / (2 a)</w:t>
-        <w:br/>
-        <w:t>]</w:t>
+        <m:oMath>
+          <m:r>
+            <m:t>x</m:t>
+          </m:r>
+          <m:r>
+            <m:t>=</m:t>
+          </m:r>
+          <m:r>
+            <m:t>(</m:t>
+          </m:r>
+          <m:r>
+            <m:t>−</m:t>
+          </m:r>
+          <m:r>
+            <m:t>b</m:t>
+          </m:r>
+          <m:r>
+            <m:t>+</m:t>
+          </m:r>
+          <m:r>
+            <m:t>−</m:t>
+          </m:r>
+          <m:r>
+            <m:t>s</m:t>
+          </m:r>
+          <m:r>
+            <m:t>q</m:t>
+          </m:r>
+          <m:r>
+            <m:t>r</m:t>
+          </m:r>
+          <m:r>
+            <m:t>t</m:t>
+          </m:r>
+          <m:r>
+            <m:t>(</m:t>
+          </m:r>
+          <m:sSup>
+            <m:e/>
+            <m:sup/>
+          </m:sSup>
+          <m:r>
+            <m:t>−</m:t>
+          </m:r>
+          <m:r>
+            <m:t>4</m:t>
+          </m:r>
+          <m:r>
+            <m:t>a</m:t>
+          </m:r>
+          <m:r>
+            <m:t>c</m:t>
+          </m:r>
+          <m:r>
+            <m:t>)</m:t>
+          </m:r>
+          <m:r>
+            <m:t>)</m:t>
+          </m:r>
+          <m:r>
+            <m:t>/</m:t>
+          </m:r>
+          <m:r>
+            <m:t>(</m:t>
+          </m:r>
+          <m:r>
+            <m:t>2</m:t>
+          </m:r>
+          <m:r>
+            <m:t>a</m:t>
+          </m:r>
+          <m:r>
+            <m:t>)</m:t>
+          </m:r>
+        </m:oMath>
       </w:r>
     </w:p>
     <w:p>
@@ -58,16 +130,35 @@
     </w:p>
     <w:p>
       <w:pPr/>
-      <w:r/>
-    </w:p>
-    <w:p>
-      <w:pPr/>
       <w:r>
-        <w:t xml:space="preserve">[FORMULA: </w:t>
-        <w:br/>
-        <w:t>sum_(i=1)^n i</w:t>
-        <w:br/>
-        <w:t>]</w:t>
+        <m:oMath>
+          <m:r>
+            <m:t>s</m:t>
+          </m:r>
+          <m:r>
+            <m:t>u</m:t>
+          </m:r>
+          <m:sSub>
+            <m:e/>
+            <m:sub/>
+          </m:sSub>
+          <m:r>
+            <m:t>i</m:t>
+          </m:r>
+          <m:r>
+            <m:t>=</m:t>
+          </m:r>
+          <m:r>
+            <m:t>1</m:t>
+          </m:r>
+          <m:sSup>
+            <m:e/>
+            <m:sup/>
+          </m:sSup>
+          <m:r>
+            <m:t>i</m:t>
+          </m:r>
+        </m:oMath>
       </w:r>
     </w:p>
     <w:p>
@@ -78,16 +169,75 @@
     </w:p>
     <w:p>
       <w:pPr/>
-      <w:r/>
-    </w:p>
-    <w:p>
-      <w:pPr/>
       <w:r>
-        <w:t xml:space="preserve">[FORMULA: </w:t>
-        <w:br/>
-        <w:t>integral_0^infinity e^(-x) d x</w:t>
-        <w:br/>
-        <w:t>]</w:t>
+        <m:oMath>
+          <m:r>
+            <m:t>i</m:t>
+          </m:r>
+          <m:r>
+            <m:t>n</m:t>
+          </m:r>
+          <m:r>
+            <m:t>t</m:t>
+          </m:r>
+          <m:r>
+            <m:t>e</m:t>
+          </m:r>
+          <m:r>
+            <m:t>g</m:t>
+          </m:r>
+          <m:r>
+            <m:t>r</m:t>
+          </m:r>
+          <m:r>
+            <m:t>a</m:t>
+          </m:r>
+          <m:sSubSup>
+            <m:e/>
+            <m:sub/>
+            <m:sup/>
+          </m:sSubSup>
+          <m:r>
+            <m:t>n</m:t>
+          </m:r>
+          <m:r>
+            <m:t>f</m:t>
+          </m:r>
+          <m:r>
+            <m:t>i</m:t>
+          </m:r>
+          <m:r>
+            <m:t>n</m:t>
+          </m:r>
+          <m:r>
+            <m:t>i</m:t>
+          </m:r>
+          <m:r>
+            <m:t>t</m:t>
+          </m:r>
+          <m:r>
+            <m:t>y</m:t>
+          </m:r>
+          <m:sSup>
+            <m:e/>
+            <m:sup/>
+          </m:sSup>
+          <m:r>
+            <m:t>−</m:t>
+          </m:r>
+          <m:r>
+            <m:t>x</m:t>
+          </m:r>
+          <m:r>
+            <m:t>)</m:t>
+          </m:r>
+          <m:r>
+            <m:t>d</m:t>
+          </m:r>
+          <m:r>
+            <m:t>x</m:t>
+          </m:r>
+        </m:oMath>
       </w:r>
     </w:p>
     <w:p>
@@ -98,16 +248,57 @@
     </w:p>
     <w:p>
       <w:pPr/>
-      <w:r/>
-    </w:p>
-    <w:p>
-      <w:pPr/>
       <w:r>
-        <w:t xml:space="preserve">[FORMULA: </w:t>
-        <w:br/>
-        <w:t>alpha + beta = gamma</w:t>
-        <w:br/>
-        <w:t>]</w:t>
+        <m:oMath>
+          <m:r>
+            <m:t>a</m:t>
+          </m:r>
+          <m:r>
+            <m:t>l</m:t>
+          </m:r>
+          <m:r>
+            <m:t>p</m:t>
+          </m:r>
+          <m:r>
+            <m:t>h</m:t>
+          </m:r>
+          <m:r>
+            <m:t>a</m:t>
+          </m:r>
+          <m:r>
+            <m:t>+</m:t>
+          </m:r>
+          <m:r>
+            <m:t>b</m:t>
+          </m:r>
+          <m:r>
+            <m:t>e</m:t>
+          </m:r>
+          <m:r>
+            <m:t>t</m:t>
+          </m:r>
+          <m:r>
+            <m:t>a</m:t>
+          </m:r>
+          <m:r>
+            <m:t>=</m:t>
+          </m:r>
+          <m:r>
+            <m:t>g</m:t>
+          </m:r>
+          <m:r>
+            <m:t>a</m:t>
+          </m:r>
+          <m:r>
+            <m:t>m</m:t>
+          </m:r>
+          <m:r>
+            <m:t>m</m:t>
+          </m:r>
+          <m:r>
+            <m:t>a</m:t>
+          </m:r>
+        </m:oMath>
       </w:r>
     </w:p>
     <w:p>
@@ -118,16 +309,133 @@
     </w:p>
     <w:p>
       <w:pPr/>
-      <w:r/>
-    </w:p>
-    <w:p>
-      <w:pPr/>
       <w:r>
-        <w:t xml:space="preserve">[FORMULA: </w:t>
-        <w:br/>
-        <w:t>integral_(-infinity)^infinity e^(-x^2) d x = sqrt(pi)</w:t>
-        <w:br/>
-        <w:t>]</w:t>
+        <m:oMath>
+          <m:r>
+            <m:t>i</m:t>
+          </m:r>
+          <m:r>
+            <m:t>n</m:t>
+          </m:r>
+          <m:r>
+            <m:t>t</m:t>
+          </m:r>
+          <m:r>
+            <m:t>e</m:t>
+          </m:r>
+          <m:r>
+            <m:t>g</m:t>
+          </m:r>
+          <m:r>
+            <m:t>r</m:t>
+          </m:r>
+          <m:r>
+            <m:t>a</m:t>
+          </m:r>
+          <m:sSub>
+            <m:e/>
+            <m:sub/>
+          </m:sSub>
+          <m:r>
+            <m:t>−</m:t>
+          </m:r>
+          <m:r>
+            <m:t>i</m:t>
+          </m:r>
+          <m:r>
+            <m:t>n</m:t>
+          </m:r>
+          <m:r>
+            <m:t>f</m:t>
+          </m:r>
+          <m:r>
+            <m:t>i</m:t>
+          </m:r>
+          <m:r>
+            <m:t>n</m:t>
+          </m:r>
+          <m:r>
+            <m:t>i</m:t>
+          </m:r>
+          <m:r>
+            <m:t>t</m:t>
+          </m:r>
+          <m:r>
+            <m:t>y</m:t>
+          </m:r>
+          <m:sSup>
+            <m:e/>
+            <m:sup/>
+          </m:sSup>
+          <m:r>
+            <m:t>n</m:t>
+          </m:r>
+          <m:r>
+            <m:t>f</m:t>
+          </m:r>
+          <m:r>
+            <m:t>i</m:t>
+          </m:r>
+          <m:r>
+            <m:t>n</m:t>
+          </m:r>
+          <m:r>
+            <m:t>i</m:t>
+          </m:r>
+          <m:r>
+            <m:t>t</m:t>
+          </m:r>
+          <m:r>
+            <m:t>y</m:t>
+          </m:r>
+          <m:sSup>
+            <m:e/>
+            <m:sup/>
+          </m:sSup>
+          <m:r>
+            <m:t>−</m:t>
+          </m:r>
+          <m:sSup>
+            <m:e/>
+            <m:sup/>
+          </m:sSup>
+          <m:r>
+            <m:t>)</m:t>
+          </m:r>
+          <m:r>
+            <m:t>d</m:t>
+          </m:r>
+          <m:r>
+            <m:t>x</m:t>
+          </m:r>
+          <m:r>
+            <m:t>=</m:t>
+          </m:r>
+          <m:r>
+            <m:t>s</m:t>
+          </m:r>
+          <m:r>
+            <m:t>q</m:t>
+          </m:r>
+          <m:r>
+            <m:t>r</m:t>
+          </m:r>
+          <m:r>
+            <m:t>t</m:t>
+          </m:r>
+          <m:r>
+            <m:t>(</m:t>
+          </m:r>
+          <m:r>
+            <m:t>p</m:t>
+          </m:r>
+          <m:r>
+            <m:t>i</m:t>
+          </m:r>
+          <m:r>
+            <m:t>)</m:t>
+          </m:r>
+        </m:oMath>
       </w:r>
     </w:p>
     <w:p>
@@ -138,16 +446,134 @@
     </w:p>
     <w:p>
       <w:pPr/>
-      <w:r/>
-    </w:p>
-    <w:p>
-      <w:pPr/>
       <w:r>
-        <w:t xml:space="preserve">[FORMULA: </w:t>
-        <w:br/>
-        <w:t>f(x) = a_0 + sum_(i=1)^infinity (a_i cos(i x) + b_i sin(i x))</w:t>
-        <w:br/>
-        <w:t>]</w:t>
+        <m:oMath>
+          <m:r>
+            <m:t>f</m:t>
+          </m:r>
+          <m:r>
+            <m:t>(</m:t>
+          </m:r>
+          <m:r>
+            <m:t>x</m:t>
+          </m:r>
+          <m:r>
+            <m:t>)</m:t>
+          </m:r>
+          <m:r>
+            <m:t>=</m:t>
+          </m:r>
+          <m:sSub>
+            <m:e/>
+            <m:sub/>
+          </m:sSub>
+          <m:r>
+            <m:t>+</m:t>
+          </m:r>
+          <m:r>
+            <m:t>s</m:t>
+          </m:r>
+          <m:r>
+            <m:t>u</m:t>
+          </m:r>
+          <m:sSub>
+            <m:e/>
+            <m:sub/>
+          </m:sSub>
+          <m:r>
+            <m:t>i</m:t>
+          </m:r>
+          <m:r>
+            <m:t>=</m:t>
+          </m:r>
+          <m:r>
+            <m:t>1</m:t>
+          </m:r>
+          <m:sSup>
+            <m:e/>
+            <m:sup/>
+          </m:sSup>
+          <m:r>
+            <m:t>n</m:t>
+          </m:r>
+          <m:r>
+            <m:t>f</m:t>
+          </m:r>
+          <m:r>
+            <m:t>i</m:t>
+          </m:r>
+          <m:r>
+            <m:t>n</m:t>
+          </m:r>
+          <m:r>
+            <m:t>i</m:t>
+          </m:r>
+          <m:r>
+            <m:t>t</m:t>
+          </m:r>
+          <m:r>
+            <m:t>y</m:t>
+          </m:r>
+          <m:r>
+            <m:t>(</m:t>
+          </m:r>
+          <m:sSub>
+            <m:e/>
+            <m:sub/>
+          </m:sSub>
+          <m:r>
+            <m:t>c</m:t>
+          </m:r>
+          <m:r>
+            <m:t>o</m:t>
+          </m:r>
+          <m:r>
+            <m:t>s</m:t>
+          </m:r>
+          <m:r>
+            <m:t>(</m:t>
+          </m:r>
+          <m:r>
+            <m:t>i</m:t>
+          </m:r>
+          <m:r>
+            <m:t>x</m:t>
+          </m:r>
+          <m:r>
+            <m:t>)</m:t>
+          </m:r>
+          <m:r>
+            <m:t>+</m:t>
+          </m:r>
+          <m:sSub>
+            <m:e/>
+            <m:sub/>
+          </m:sSub>
+          <m:r>
+            <m:t>s</m:t>
+          </m:r>
+          <m:r>
+            <m:t>i</m:t>
+          </m:r>
+          <m:r>
+            <m:t>n</m:t>
+          </m:r>
+          <m:r>
+            <m:t>(</m:t>
+          </m:r>
+          <m:r>
+            <m:t>i</m:t>
+          </m:r>
+          <m:r>
+            <m:t>x</m:t>
+          </m:r>
+          <m:r>
+            <m:t>)</m:t>
+          </m:r>
+          <m:r>
+            <m:t>)</m:t>
+          </m:r>
+        </m:oMath>
       </w:r>
     </w:p>
     <w:p>
@@ -158,16 +584,40 @@
     </w:p>
     <w:p>
       <w:pPr/>
-      <w:r/>
-    </w:p>
-    <w:p>
-      <w:pPr/>
       <w:r>
-        <w:t xml:space="preserve">[FORMULA: </w:t>
-        <w:br/>
-        <w:t>log_e (a) = ln a</w:t>
-        <w:br/>
-        <w:t>]</w:t>
+        <m:oMath>
+          <m:r>
+            <m:t>l</m:t>
+          </m:r>
+          <m:r>
+            <m:t>o</m:t>
+          </m:r>
+          <m:sSub>
+            <m:e/>
+            <m:sub/>
+          </m:sSub>
+          <m:r>
+            <m:t>(</m:t>
+          </m:r>
+          <m:r>
+            <m:t>a</m:t>
+          </m:r>
+          <m:r>
+            <m:t>)</m:t>
+          </m:r>
+          <m:r>
+            <m:t>=</m:t>
+          </m:r>
+          <m:r>
+            <m:t>l</m:t>
+          </m:r>
+          <m:r>
+            <m:t>n</m:t>
+          </m:r>
+          <m:r>
+            <m:t>a</m:t>
+          </m:r>
+        </m:oMath>
       </w:r>
     </w:p>
     <w:p>
@@ -178,16 +628,22 @@
     </w:p>
     <w:p>
       <w:pPr/>
-      <w:r/>
-    </w:p>
-    <w:p>
-      <w:pPr/>
       <w:r>
-        <w:t xml:space="preserve">[FORMULA: </w:t>
-        <w:br/>
-        <w:t>2^10 = 1024</w:t>
-        <w:br/>
-        <w:t>]</w:t>
+        <m:oMath>
+          <m:sSup>
+            <m:e/>
+            <m:sup/>
+          </m:sSup>
+          <m:r>
+            <m:t>0</m:t>
+          </m:r>
+          <m:r>
+            <m:t>=</m:t>
+          </m:r>
+          <m:r>
+            <m:t>1024</m:t>
+          </m:r>
+        </m:oMath>
       </w:r>
     </w:p>
     <w:sectPr>

</xml_diff>